<commit_message>
Fix RUT saving in edge function
</commit_message>
<xml_diff>
--- a/public/acta_template.docx
+++ b/public/acta_template.docx
@@ -74,15 +74,7 @@
                 <w:rStyle w:val="Normal1"/>
                 <w:rFonts w:ascii="Aptos Display" w:hAnsi="Aptos Display"/>
               </w:rPr>
-              <w:t>{</w:t>
-            </w:r>
-            <w:proofErr w:type="spellStart"/>
-            <w:r>
-              <w:rPr>
-                <w:rStyle w:val="Normal1"/>
-                <w:rFonts w:ascii="Aptos Display" w:hAnsi="Aptos Display"/>
-              </w:rPr>
-              <w:t>ti_</w:t>
+              <w:t>{ti_</w:t>
             </w:r>
             <w:r>
               <w:rPr>
@@ -91,7 +83,6 @@
               </w:rPr>
               <w:t>rut</w:t>
             </w:r>
-            <w:proofErr w:type="spellEnd"/>
             <w:r>
               <w:rPr>
                 <w:rStyle w:val="Normal1"/>
@@ -119,23 +110,7 @@
                 <w:rStyle w:val="Normal1"/>
                 <w:rFonts w:ascii="Aptos Display" w:hAnsi="Aptos Display"/>
               </w:rPr>
-              <w:t>{</w:t>
-            </w:r>
-            <w:proofErr w:type="spellStart"/>
-            <w:r>
-              <w:rPr>
-                <w:rStyle w:val="Normal1"/>
-                <w:rFonts w:ascii="Aptos Display" w:hAnsi="Aptos Display"/>
-              </w:rPr>
-              <w:t>ti_nombre</w:t>
-            </w:r>
-            <w:proofErr w:type="spellEnd"/>
-            <w:r>
-              <w:rPr>
-                <w:rStyle w:val="Normal1"/>
-                <w:rFonts w:ascii="Aptos Display" w:hAnsi="Aptos Display"/>
-              </w:rPr>
-              <w:t>}</w:t>
+              <w:t>{ti_nombre}</w:t>
             </w:r>
           </w:p>
         </w:tc>
@@ -157,7 +132,7 @@
                 <w:rStyle w:val="Normal1"/>
                 <w:rFonts w:ascii="Aptos Display" w:hAnsi="Aptos Display"/>
               </w:rPr>
-              <w:t>Tecnologías de la Información</w:t>
+              <w:t>{ti_subdireccion}</w:t>
             </w:r>
           </w:p>
         </w:tc>
@@ -303,15 +278,7 @@
                 <w:rStyle w:val="Normal1"/>
                 <w:rFonts w:ascii="Aptos Display" w:hAnsi="Aptos Display"/>
               </w:rPr>
-              <w:t>{</w:t>
-            </w:r>
-            <w:proofErr w:type="spellStart"/>
-            <w:r>
-              <w:rPr>
-                <w:rStyle w:val="Normal1"/>
-                <w:rFonts w:ascii="Aptos Display" w:hAnsi="Aptos Display"/>
-              </w:rPr>
-              <w:t>solicitante_</w:t>
+              <w:t>{solicitante_</w:t>
             </w:r>
             <w:r>
               <w:rPr>
@@ -320,7 +287,6 @@
               </w:rPr>
               <w:t>rut</w:t>
             </w:r>
-            <w:proofErr w:type="spellEnd"/>
             <w:r>
               <w:rPr>
                 <w:rStyle w:val="Normal1"/>
@@ -348,23 +314,7 @@
                 <w:rStyle w:val="Normal1"/>
                 <w:rFonts w:ascii="Aptos Display" w:hAnsi="Aptos Display"/>
               </w:rPr>
-              <w:t>{</w:t>
-            </w:r>
-            <w:proofErr w:type="spellStart"/>
-            <w:r>
-              <w:rPr>
-                <w:rStyle w:val="Normal1"/>
-                <w:rFonts w:ascii="Aptos Display" w:hAnsi="Aptos Display"/>
-              </w:rPr>
-              <w:t>solicitante_nombre</w:t>
-            </w:r>
-            <w:proofErr w:type="spellEnd"/>
-            <w:r>
-              <w:rPr>
-                <w:rStyle w:val="Normal1"/>
-                <w:rFonts w:ascii="Aptos Display" w:hAnsi="Aptos Display"/>
-              </w:rPr>
-              <w:t>}</w:t>
+              <w:t>{solicitante_nombre}</w:t>
             </w:r>
           </w:p>
         </w:tc>
@@ -386,23 +336,7 @@
                 <w:rStyle w:val="Normal1"/>
                 <w:rFonts w:ascii="Aptos Display" w:hAnsi="Aptos Display"/>
               </w:rPr>
-              <w:t>{</w:t>
-            </w:r>
-            <w:proofErr w:type="spellStart"/>
-            <w:r>
-              <w:rPr>
-                <w:rStyle w:val="Normal1"/>
-                <w:rFonts w:ascii="Aptos Display" w:hAnsi="Aptos Display"/>
-              </w:rPr>
-              <w:t>subdireccion</w:t>
-            </w:r>
-            <w:proofErr w:type="spellEnd"/>
-            <w:r>
-              <w:rPr>
-                <w:rStyle w:val="Normal1"/>
-                <w:rFonts w:ascii="Aptos Display" w:hAnsi="Aptos Display"/>
-              </w:rPr>
-              <w:t>}</w:t>
+              <w:t>{solicitante_subdireccion}</w:t>
             </w:r>
           </w:p>
         </w:tc>
@@ -540,11 +474,11 @@
         <w:tblLook w:val="04A0" w:firstRow="1" w:lastRow="0" w:firstColumn="1" w:lastColumn="0" w:noHBand="0" w:noVBand="1"/>
       </w:tblPr>
       <w:tblGrid>
-        <w:gridCol w:w="1696"/>
-        <w:gridCol w:w="2977"/>
-        <w:gridCol w:w="2126"/>
-        <w:gridCol w:w="2127"/>
-        <w:gridCol w:w="1864"/>
+        <w:gridCol w:w="1770"/>
+        <w:gridCol w:w="2881"/>
+        <w:gridCol w:w="2018"/>
+        <w:gridCol w:w="2099"/>
+        <w:gridCol w:w="2022"/>
       </w:tblGrid>
       <w:tr>
         <w:tc>
@@ -678,6 +612,13 @@
                 <w:rFonts w:ascii="Aptos Display" w:hAnsi="Aptos Display"/>
               </w:rPr>
             </w:pPr>
+            <w:r>
+              <w:rPr>
+                <w:rStyle w:val="Normal1"/>
+                <w:rFonts w:ascii="Aptos Display" w:hAnsi="Aptos Display"/>
+              </w:rPr>
+              <w:t>{#equipos}{tipo}</w:t>
+            </w:r>
           </w:p>
         </w:tc>
         <w:tc>
@@ -692,6 +633,13 @@
                 <w:rFonts w:ascii="Aptos Display" w:hAnsi="Aptos Display"/>
               </w:rPr>
             </w:pPr>
+            <w:r>
+              <w:rPr>
+                <w:rStyle w:val="Normal1"/>
+                <w:rFonts w:ascii="Aptos Display" w:hAnsi="Aptos Display"/>
+              </w:rPr>
+              <w:t>{marca_modelo}</w:t>
+            </w:r>
           </w:p>
         </w:tc>
         <w:tc>
@@ -706,6 +654,13 @@
                 <w:rFonts w:ascii="Aptos Display" w:hAnsi="Aptos Display"/>
               </w:rPr>
             </w:pPr>
+            <w:r>
+              <w:rPr>
+                <w:rStyle w:val="Normal1"/>
+                <w:rFonts w:ascii="Aptos Display" w:hAnsi="Aptos Display"/>
+              </w:rPr>
+              <w:t>{serie}</w:t>
+            </w:r>
           </w:p>
         </w:tc>
         <w:tc>
@@ -720,6 +675,13 @@
                 <w:rFonts w:ascii="Aptos Display" w:hAnsi="Aptos Display"/>
               </w:rPr>
             </w:pPr>
+            <w:r>
+              <w:rPr>
+                <w:rStyle w:val="Normal1"/>
+                <w:rFonts w:ascii="Aptos Display" w:hAnsi="Aptos Display"/>
+              </w:rPr>
+              <w:t>{codigo_interno}</w:t>
+            </w:r>
           </w:p>
         </w:tc>
         <w:tc>
@@ -734,6 +696,13 @@
                 <w:rFonts w:ascii="Aptos Display" w:hAnsi="Aptos Display"/>
               </w:rPr>
             </w:pPr>
+            <w:r>
+              <w:rPr>
+                <w:rStyle w:val="Normal1"/>
+                <w:rFonts w:ascii="Aptos Display" w:hAnsi="Aptos Display"/>
+              </w:rPr>
+              <w:t>{estado}{/equipos}</w:t>
+            </w:r>
           </w:p>
         </w:tc>
       </w:tr>
@@ -5899,7 +5868,6 @@
   <w:style w:type="character" w:default="1" w:styleId="Fuentedeprrafopredeter">
     <w:name w:val="Default Paragraph Font"/>
     <w:uiPriority w:val="1"/>
-    <w:semiHidden/>
     <w:unhideWhenUsed/>
   </w:style>
   <w:style w:type="table" w:default="1" w:styleId="Tablanormal">
@@ -6657,6 +6625,27 @@
 </file>
 
 <file path=customXml/item1.xml><?xml version="1.0" encoding="utf-8"?>
+<p:properties xmlns:p="http://schemas.microsoft.com/office/2006/metadata/properties" xmlns:xsi="http://www.w3.org/2001/XMLSchema-instance" xmlns:pc="http://schemas.microsoft.com/office/infopath/2007/PartnerControls">
+  <documentManagement>
+    <_activity xmlns="bcce9e69-2193-489b-8979-bcf4d9513be1" xsi:nil="true"/>
+  </documentManagement>
+</p:properties>
+</file>
+
+<file path=customXml/item2.xml><?xml version="1.0" encoding="utf-8"?>
+<?mso-contentType ?>
+<FormTemplates xmlns="http://schemas.microsoft.com/sharepoint/v3/contenttype/forms">
+  <Display>DocumentLibraryForm</Display>
+  <Edit>DocumentLibraryForm</Edit>
+  <New>DocumentLibraryForm</New>
+</FormTemplates>
+</file>
+
+<file path=customXml/item3.xml><?xml version="1.0" encoding="utf-8"?>
+<b:Sources xmlns:b="http://schemas.openxmlformats.org/officeDocument/2006/bibliography" xmlns="http://schemas.openxmlformats.org/officeDocument/2006/bibliography" SelectedStyle="\APA.XSL" StyleName="APA"/>
+</file>
+
+<file path=customXml/item4.xml><?xml version="1.0" encoding="utf-8"?>
 <ct:contentTypeSchema xmlns:ct="http://schemas.microsoft.com/office/2006/metadata/contentType" xmlns:ma="http://schemas.microsoft.com/office/2006/metadata/properties/metaAttributes" ct:_="" ma:_="" ma:contentTypeName="Document" ma:contentTypeID="0x010100D2977320FF50BE48B7E8EE87EBCF0601" ma:contentTypeVersion="11" ma:contentTypeDescription="Create a new document." ma:contentTypeScope="" ma:versionID="d3e0c027367d740cbf39034df56ffe22">
   <xsd:schema xmlns:xsd="http://www.w3.org/2001/XMLSchema" xmlns:xs="http://www.w3.org/2001/XMLSchema" xmlns:p="http://schemas.microsoft.com/office/2006/metadata/properties" xmlns:ns3="bcce9e69-2193-489b-8979-bcf4d9513be1" targetNamespace="http://schemas.microsoft.com/office/2006/metadata/properties" ma:root="true" ma:fieldsID="28b1c348ba72a3784f3915424c61e130" ns3:_="">
     <xsd:import namespace="bcce9e69-2193-489b-8979-bcf4d9513be1"/>
@@ -6844,28 +6833,33 @@
 </ct:contentTypeSchema>
 </file>
 
-<file path=customXml/item2.xml><?xml version="1.0" encoding="utf-8"?>
-<b:Sources xmlns:b="http://schemas.openxmlformats.org/officeDocument/2006/bibliography" xmlns="http://schemas.openxmlformats.org/officeDocument/2006/bibliography" SelectedStyle="\APA.XSL" StyleName="APA"/>
+<file path=customXml/itemProps1.xml><?xml version="1.0" encoding="utf-8"?>
+<ds:datastoreItem xmlns:ds="http://schemas.openxmlformats.org/officeDocument/2006/customXml" ds:itemID="{B8E5FF8D-93DF-42F5-8D0C-D6D6D31AB061}">
+  <ds:schemaRefs>
+    <ds:schemaRef ds:uri="http://schemas.microsoft.com/office/2006/metadata/properties"/>
+    <ds:schemaRef ds:uri="http://schemas.microsoft.com/office/infopath/2007/PartnerControls"/>
+    <ds:schemaRef ds:uri="bcce9e69-2193-489b-8979-bcf4d9513be1"/>
+  </ds:schemaRefs>
+</ds:datastoreItem>
 </file>
 
-<file path=customXml/item3.xml><?xml version="1.0" encoding="utf-8"?>
-<?mso-contentType ?>
-<FormTemplates xmlns="http://schemas.microsoft.com/sharepoint/v3/contenttype/forms">
-  <Display>DocumentLibraryForm</Display>
-  <Edit>DocumentLibraryForm</Edit>
-  <New>DocumentLibraryForm</New>
-</FormTemplates>
+<file path=customXml/itemProps2.xml><?xml version="1.0" encoding="utf-8"?>
+<ds:datastoreItem xmlns:ds="http://schemas.openxmlformats.org/officeDocument/2006/customXml" ds:itemID="{4FB0072D-4D86-4287-A28D-140B2D94D6E6}">
+  <ds:schemaRefs>
+    <ds:schemaRef ds:uri="http://schemas.microsoft.com/sharepoint/v3/contenttype/forms"/>
+  </ds:schemaRefs>
+</ds:datastoreItem>
 </file>
 
-<file path=customXml/item4.xml><?xml version="1.0" encoding="utf-8"?>
-<p:properties xmlns:p="http://schemas.microsoft.com/office/2006/metadata/properties" xmlns:xsi="http://www.w3.org/2001/XMLSchema-instance" xmlns:pc="http://schemas.microsoft.com/office/infopath/2007/PartnerControls">
-  <documentManagement>
-    <_activity xmlns="bcce9e69-2193-489b-8979-bcf4d9513be1" xsi:nil="true"/>
-  </documentManagement>
-</p:properties>
+<file path=customXml/itemProps3.xml><?xml version="1.0" encoding="utf-8"?>
+<ds:datastoreItem xmlns:ds="http://schemas.openxmlformats.org/officeDocument/2006/customXml" ds:itemID="{5AF88806-9421-4965-9206-D524E6254C01}">
+  <ds:schemaRefs>
+    <ds:schemaRef ds:uri="http://schemas.openxmlformats.org/officeDocument/2006/bibliography"/>
+  </ds:schemaRefs>
+</ds:datastoreItem>
 </file>
 
-<file path=customXml/itemProps1.xml><?xml version="1.0" encoding="utf-8"?>
+<file path=customXml/itemProps4.xml><?xml version="1.0" encoding="utf-8"?>
 <ds:datastoreItem xmlns:ds="http://schemas.openxmlformats.org/officeDocument/2006/customXml" ds:itemID="{48A79393-5999-4CA9-8AB6-5E47C855988B}">
   <ds:schemaRefs>
     <ds:schemaRef ds:uri="http://schemas.microsoft.com/office/2006/metadata/contentType"/>
@@ -6883,32 +6877,6 @@
 </ds:datastoreItem>
 </file>
 
-<file path=customXml/itemProps2.xml><?xml version="1.0" encoding="utf-8"?>
-<ds:datastoreItem xmlns:ds="http://schemas.openxmlformats.org/officeDocument/2006/customXml" ds:itemID="{5AF88806-9421-4965-9206-D524E6254C01}">
-  <ds:schemaRefs>
-    <ds:schemaRef ds:uri="http://schemas.openxmlformats.org/officeDocument/2006/bibliography"/>
-  </ds:schemaRefs>
-</ds:datastoreItem>
-</file>
-
-<file path=customXml/itemProps3.xml><?xml version="1.0" encoding="utf-8"?>
-<ds:datastoreItem xmlns:ds="http://schemas.openxmlformats.org/officeDocument/2006/customXml" ds:itemID="{4FB0072D-4D86-4287-A28D-140B2D94D6E6}">
-  <ds:schemaRefs>
-    <ds:schemaRef ds:uri="http://schemas.microsoft.com/sharepoint/v3/contenttype/forms"/>
-  </ds:schemaRefs>
-</ds:datastoreItem>
-</file>
-
-<file path=customXml/itemProps4.xml><?xml version="1.0" encoding="utf-8"?>
-<ds:datastoreItem xmlns:ds="http://schemas.openxmlformats.org/officeDocument/2006/customXml" ds:itemID="{B8E5FF8D-93DF-42F5-8D0C-D6D6D31AB061}">
-  <ds:schemaRefs>
-    <ds:schemaRef ds:uri="http://schemas.microsoft.com/office/2006/metadata/properties"/>
-    <ds:schemaRef ds:uri="http://schemas.microsoft.com/office/infopath/2007/PartnerControls"/>
-    <ds:schemaRef ds:uri="bcce9e69-2193-489b-8979-bcf4d9513be1"/>
-  </ds:schemaRefs>
-</ds:datastoreItem>
-</file>
-
 <file path=docMetadata/LabelInfo.xml><?xml version="1.0" encoding="utf-8"?>
 <clbl:labelList xmlns:clbl="http://schemas.microsoft.com/office/2020/mipLabelMetadata">
   <clbl:label id="{98533b19-5b8e-4b87-8bd4-14d058a7d451}" enabled="0" method="" siteId="{98533b19-5b8e-4b87-8bd4-14d058a7d451}" removed="1"/>

</xml_diff>

<commit_message>
Add conditions, remove title, and implement new Actas generation
</commit_message>
<xml_diff>
--- a/public/acta_template.docx
+++ b/public/acta_template.docx
@@ -17,16 +17,16 @@
         <w:rPr>
           <w:rStyle w:val="Normal1"/>
           <w:rFonts w:ascii="Aptos Display" w:hAnsi="Aptos Display"/>
-          <w:sz w:val="20"/>
-          <w:szCs w:val="20"/>
+          <w:sz w:val="22"/>
+          <w:szCs w:val="22"/>
         </w:rPr>
       </w:pPr>
       <w:r>
         <w:rPr>
           <w:rStyle w:val="Normal1"/>
           <w:rFonts w:ascii="Aptos Display" w:hAnsi="Aptos Display"/>
-          <w:sz w:val="20"/>
-          <w:szCs w:val="20"/>
+          <w:sz w:val="22"/>
+          <w:szCs w:val="22"/>
         </w:rPr>
         <w:t>DATOS FUNCIONARIO/A TI RESPONSABLE DE CONFIGURACION Y ENTREGA DE EQUIPO:</w:t>
       </w:r>
@@ -48,9 +48,9 @@
         <w:tblLook w:val="04A0" w:firstRow="1" w:lastRow="0" w:firstColumn="1" w:lastColumn="0" w:noHBand="0" w:noVBand="1"/>
       </w:tblPr>
       <w:tblGrid>
-        <w:gridCol w:w="2547"/>
-        <w:gridCol w:w="4678"/>
-        <w:gridCol w:w="3543"/>
+        <w:gridCol w:w="1701"/>
+        <w:gridCol w:w="4248"/>
+        <w:gridCol w:w="4819"/>
       </w:tblGrid>
       <w:tr>
         <w:trPr>
@@ -58,7 +58,7 @@
         </w:trPr>
         <w:tc>
           <w:tcPr>
-            <w:tcW w:w="2547" w:type="dxa"/>
+            <w:tcW w:w="1701" w:type="dxa"/>
             <w:vAlign w:val="center"/>
           </w:tcPr>
           <w:p>
@@ -74,7 +74,15 @@
                 <w:rStyle w:val="Normal1"/>
                 <w:rFonts w:ascii="Aptos Display" w:hAnsi="Aptos Display"/>
               </w:rPr>
-              <w:t>{ti_</w:t>
+              <w:t>{</w:t>
+            </w:r>
+            <w:proofErr w:type="spellStart"/>
+            <w:r>
+              <w:rPr>
+                <w:rStyle w:val="Normal1"/>
+                <w:rFonts w:ascii="Aptos Display" w:hAnsi="Aptos Display"/>
+              </w:rPr>
+              <w:t>ti_</w:t>
             </w:r>
             <w:r>
               <w:rPr>
@@ -83,6 +91,7 @@
               </w:rPr>
               <w:t>rut</w:t>
             </w:r>
+            <w:proofErr w:type="spellEnd"/>
             <w:r>
               <w:rPr>
                 <w:rStyle w:val="Normal1"/>
@@ -94,7 +103,7 @@
         </w:tc>
         <w:tc>
           <w:tcPr>
-            <w:tcW w:w="4678" w:type="dxa"/>
+            <w:tcW w:w="4248" w:type="dxa"/>
             <w:vAlign w:val="center"/>
           </w:tcPr>
           <w:p>
@@ -110,13 +119,29 @@
                 <w:rStyle w:val="Normal1"/>
                 <w:rFonts w:ascii="Aptos Display" w:hAnsi="Aptos Display"/>
               </w:rPr>
-              <w:t>{ti_nombre}</w:t>
+              <w:t>{</w:t>
+            </w:r>
+            <w:proofErr w:type="spellStart"/>
+            <w:r>
+              <w:rPr>
+                <w:rStyle w:val="Normal1"/>
+                <w:rFonts w:ascii="Aptos Display" w:hAnsi="Aptos Display"/>
+              </w:rPr>
+              <w:t>ti_nombre</w:t>
+            </w:r>
+            <w:proofErr w:type="spellEnd"/>
+            <w:r>
+              <w:rPr>
+                <w:rStyle w:val="Normal1"/>
+                <w:rFonts w:ascii="Aptos Display" w:hAnsi="Aptos Display"/>
+              </w:rPr>
+              <w:t>}</w:t>
             </w:r>
           </w:p>
         </w:tc>
         <w:tc>
           <w:tcPr>
-            <w:tcW w:w="3543" w:type="dxa"/>
+            <w:tcW w:w="4819" w:type="dxa"/>
             <w:vAlign w:val="center"/>
           </w:tcPr>
           <w:p>
@@ -132,7 +157,23 @@
                 <w:rStyle w:val="Normal1"/>
                 <w:rFonts w:ascii="Aptos Display" w:hAnsi="Aptos Display"/>
               </w:rPr>
-              <w:t>{ti_subdireccion}</w:t>
+              <w:t>{</w:t>
+            </w:r>
+            <w:proofErr w:type="spellStart"/>
+            <w:r>
+              <w:rPr>
+                <w:rStyle w:val="Normal1"/>
+                <w:rFonts w:ascii="Aptos Display" w:hAnsi="Aptos Display"/>
+              </w:rPr>
+              <w:t>ti_subdireccion</w:t>
+            </w:r>
+            <w:proofErr w:type="spellEnd"/>
+            <w:r>
+              <w:rPr>
+                <w:rStyle w:val="Normal1"/>
+                <w:rFonts w:ascii="Aptos Display" w:hAnsi="Aptos Display"/>
+              </w:rPr>
+              <w:t>}</w:t>
             </w:r>
           </w:p>
         </w:tc>
@@ -140,7 +181,7 @@
       <w:tr>
         <w:tc>
           <w:tcPr>
-            <w:tcW w:w="2547" w:type="dxa"/>
+            <w:tcW w:w="1701" w:type="dxa"/>
             <w:shd w:val="clear" w:color="auto" w:fill="D9D9D9" w:themeFill="background1" w:themeFillShade="D9"/>
           </w:tcPr>
           <w:p>
@@ -162,7 +203,7 @@
         </w:tc>
         <w:tc>
           <w:tcPr>
-            <w:tcW w:w="4678" w:type="dxa"/>
+            <w:tcW w:w="4248" w:type="dxa"/>
             <w:shd w:val="clear" w:color="auto" w:fill="D9D9D9" w:themeFill="background1" w:themeFillShade="D9"/>
           </w:tcPr>
           <w:p>
@@ -184,7 +225,7 @@
         </w:tc>
         <w:tc>
           <w:tcPr>
-            <w:tcW w:w="3543" w:type="dxa"/>
+            <w:tcW w:w="4819" w:type="dxa"/>
             <w:shd w:val="clear" w:color="auto" w:fill="D9D9D9" w:themeFill="background1" w:themeFillShade="D9"/>
           </w:tcPr>
           <w:p>
@@ -221,40 +262,41 @@
         <w:rPr>
           <w:rStyle w:val="Normal1"/>
           <w:rFonts w:ascii="Aptos Display" w:hAnsi="Aptos Display"/>
-          <w:sz w:val="20"/>
-          <w:szCs w:val="20"/>
+          <w:sz w:val="22"/>
+          <w:szCs w:val="22"/>
         </w:rPr>
       </w:pPr>
       <w:r>
+        <w:rPr>
+          <w:rStyle w:val="Normal1"/>
+          <w:rFonts w:ascii="Aptos Display" w:hAnsi="Aptos Display"/>
+          <w:sz w:val="22"/>
+          <w:szCs w:val="22"/>
+        </w:rPr>
+        <w:t>DATOS FUNCIONARIO/A SOLICITANTE:</w:t>
+      </w:r>
+    </w:p>
+    <w:p>
+      <w:pPr>
         <w:rPr>
           <w:rStyle w:val="Normal1"/>
           <w:rFonts w:ascii="Aptos Display" w:hAnsi="Aptos Display"/>
           <w:sz w:val="20"/>
           <w:szCs w:val="20"/>
         </w:rPr>
-        <w:t>DATOS FUNCIONARIO/A SOLICITANTE:</w:t>
-      </w:r>
-    </w:p>
-    <w:p>
-      <w:pPr>
-        <w:rPr>
-          <w:rStyle w:val="Normal1"/>
-          <w:rFonts w:ascii="Aptos Display" w:hAnsi="Aptos Display"/>
-          <w:sz w:val="20"/>
-          <w:szCs w:val="20"/>
-        </w:rPr>
       </w:pPr>
     </w:p>
     <w:tbl>
       <w:tblPr>
         <w:tblStyle w:val="Tablaconcuadrcula"/>
         <w:tblW w:w="0" w:type="auto"/>
+        <w:tblLayout w:type="fixed"/>
         <w:tblLook w:val="04A0" w:firstRow="1" w:lastRow="0" w:firstColumn="1" w:lastColumn="0" w:noHBand="0" w:noVBand="1"/>
       </w:tblPr>
       <w:tblGrid>
-        <w:gridCol w:w="2547"/>
-        <w:gridCol w:w="4678"/>
-        <w:gridCol w:w="3543"/>
+        <w:gridCol w:w="1752"/>
+        <w:gridCol w:w="4253"/>
+        <w:gridCol w:w="4841"/>
       </w:tblGrid>
       <w:tr>
         <w:trPr>
@@ -262,7 +304,7 @@
         </w:trPr>
         <w:tc>
           <w:tcPr>
-            <w:tcW w:w="2547" w:type="dxa"/>
+            <w:tcW w:w="1752" w:type="dxa"/>
             <w:vAlign w:val="center"/>
           </w:tcPr>
           <w:p>
@@ -278,7 +320,15 @@
                 <w:rStyle w:val="Normal1"/>
                 <w:rFonts w:ascii="Aptos Display" w:hAnsi="Aptos Display"/>
               </w:rPr>
-              <w:t>{solicitante_</w:t>
+              <w:t>{</w:t>
+            </w:r>
+            <w:proofErr w:type="spellStart"/>
+            <w:r>
+              <w:rPr>
+                <w:rStyle w:val="Normal1"/>
+                <w:rFonts w:ascii="Aptos Display" w:hAnsi="Aptos Display"/>
+              </w:rPr>
+              <w:t>solicitante_</w:t>
             </w:r>
             <w:r>
               <w:rPr>
@@ -287,6 +337,7 @@
               </w:rPr>
               <w:t>rut</w:t>
             </w:r>
+            <w:proofErr w:type="spellEnd"/>
             <w:r>
               <w:rPr>
                 <w:rStyle w:val="Normal1"/>
@@ -298,7 +349,7 @@
         </w:tc>
         <w:tc>
           <w:tcPr>
-            <w:tcW w:w="4678" w:type="dxa"/>
+            <w:tcW w:w="4253" w:type="dxa"/>
             <w:vAlign w:val="center"/>
           </w:tcPr>
           <w:p>
@@ -314,13 +365,29 @@
                 <w:rStyle w:val="Normal1"/>
                 <w:rFonts w:ascii="Aptos Display" w:hAnsi="Aptos Display"/>
               </w:rPr>
-              <w:t>{solicitante_nombre}</w:t>
+              <w:t>{</w:t>
+            </w:r>
+            <w:proofErr w:type="spellStart"/>
+            <w:r>
+              <w:rPr>
+                <w:rStyle w:val="Normal1"/>
+                <w:rFonts w:ascii="Aptos Display" w:hAnsi="Aptos Display"/>
+              </w:rPr>
+              <w:t>solicitante_nombre</w:t>
+            </w:r>
+            <w:proofErr w:type="spellEnd"/>
+            <w:r>
+              <w:rPr>
+                <w:rStyle w:val="Normal1"/>
+                <w:rFonts w:ascii="Aptos Display" w:hAnsi="Aptos Display"/>
+              </w:rPr>
+              <w:t>}</w:t>
             </w:r>
           </w:p>
         </w:tc>
         <w:tc>
           <w:tcPr>
-            <w:tcW w:w="3543" w:type="dxa"/>
+            <w:tcW w:w="4841" w:type="dxa"/>
             <w:vAlign w:val="center"/>
           </w:tcPr>
           <w:p>
@@ -336,7 +403,23 @@
                 <w:rStyle w:val="Normal1"/>
                 <w:rFonts w:ascii="Aptos Display" w:hAnsi="Aptos Display"/>
               </w:rPr>
-              <w:t>{solicitante_subdireccion}</w:t>
+              <w:t>{</w:t>
+            </w:r>
+            <w:proofErr w:type="spellStart"/>
+            <w:r>
+              <w:rPr>
+                <w:rStyle w:val="Normal1"/>
+                <w:rFonts w:ascii="Aptos Display" w:hAnsi="Aptos Display"/>
+              </w:rPr>
+              <w:t>solicitante_subdireccion</w:t>
+            </w:r>
+            <w:proofErr w:type="spellEnd"/>
+            <w:r>
+              <w:rPr>
+                <w:rStyle w:val="Normal1"/>
+                <w:rFonts w:ascii="Aptos Display" w:hAnsi="Aptos Display"/>
+              </w:rPr>
+              <w:t>}</w:t>
             </w:r>
           </w:p>
         </w:tc>
@@ -344,7 +427,7 @@
       <w:tr>
         <w:tc>
           <w:tcPr>
-            <w:tcW w:w="2547" w:type="dxa"/>
+            <w:tcW w:w="1752" w:type="dxa"/>
             <w:shd w:val="clear" w:color="auto" w:fill="D9D9D9" w:themeFill="background1" w:themeFillShade="D9"/>
           </w:tcPr>
           <w:p>
@@ -366,7 +449,7 @@
         </w:tc>
         <w:tc>
           <w:tcPr>
-            <w:tcW w:w="4678" w:type="dxa"/>
+            <w:tcW w:w="4253" w:type="dxa"/>
             <w:shd w:val="clear" w:color="auto" w:fill="D9D9D9" w:themeFill="background1" w:themeFillShade="D9"/>
           </w:tcPr>
           <w:p>
@@ -388,7 +471,7 @@
         </w:tc>
         <w:tc>
           <w:tcPr>
-            <w:tcW w:w="3543" w:type="dxa"/>
+            <w:tcW w:w="4841" w:type="dxa"/>
             <w:shd w:val="clear" w:color="auto" w:fill="D9D9D9" w:themeFill="background1" w:themeFillShade="D9"/>
           </w:tcPr>
           <w:p>
@@ -470,20 +553,18 @@
     <w:tbl>
       <w:tblPr>
         <w:tblStyle w:val="Tablaconcuadrcula"/>
-        <w:tblW w:w="0" w:type="auto"/>
+        <w:tblW w:w="10830" w:type="dxa"/>
         <w:tblLook w:val="04A0" w:firstRow="1" w:lastRow="0" w:firstColumn="1" w:lastColumn="0" w:noHBand="0" w:noVBand="1"/>
       </w:tblPr>
       <w:tblGrid>
-        <w:gridCol w:w="1770"/>
-        <w:gridCol w:w="2881"/>
-        <w:gridCol w:w="2018"/>
-        <w:gridCol w:w="2099"/>
-        <w:gridCol w:w="2022"/>
+        <w:gridCol w:w="2405"/>
+        <w:gridCol w:w="5670"/>
+        <w:gridCol w:w="2755"/>
       </w:tblGrid>
       <w:tr>
         <w:tc>
           <w:tcPr>
-            <w:tcW w:w="1696" w:type="dxa"/>
+            <w:tcW w:w="2405" w:type="dxa"/>
             <w:shd w:val="clear" w:color="auto" w:fill="D9D9D9" w:themeFill="background1" w:themeFillShade="D9"/>
           </w:tcPr>
           <w:p>
@@ -505,7 +586,7 @@
         </w:tc>
         <w:tc>
           <w:tcPr>
-            <w:tcW w:w="2977" w:type="dxa"/>
+            <w:tcW w:w="5670" w:type="dxa"/>
             <w:shd w:val="clear" w:color="auto" w:fill="D9D9D9" w:themeFill="background1" w:themeFillShade="D9"/>
           </w:tcPr>
           <w:p>
@@ -527,7 +608,7 @@
         </w:tc>
         <w:tc>
           <w:tcPr>
-            <w:tcW w:w="2126" w:type="dxa"/>
+            <w:tcW w:w="2755" w:type="dxa"/>
             <w:shd w:val="clear" w:color="auto" w:fill="D9D9D9" w:themeFill="background1" w:themeFillShade="D9"/>
           </w:tcPr>
           <w:p>
@@ -538,63 +619,21 @@
                 <w:rFonts w:ascii="Aptos Display" w:hAnsi="Aptos Display"/>
               </w:rPr>
             </w:pPr>
+            <w:proofErr w:type="spellStart"/>
             <w:r>
               <w:rPr>
                 <w:rStyle w:val="Normal1"/>
                 <w:rFonts w:ascii="Aptos Display" w:hAnsi="Aptos Display"/>
               </w:rPr>
-              <w:t>N° de serie</w:t>
+              <w:t>N°</w:t>
             </w:r>
-          </w:p>
-        </w:tc>
-        <w:tc>
-          <w:tcPr>
-            <w:tcW w:w="2127" w:type="dxa"/>
-            <w:shd w:val="clear" w:color="auto" w:fill="D9D9D9" w:themeFill="background1" w:themeFillShade="D9"/>
-          </w:tcPr>
-          <w:p>
-            <w:pPr>
-              <w:jc w:val="center"/>
-              <w:rPr>
-                <w:rStyle w:val="Normal1"/>
-                <w:rFonts w:ascii="Aptos Display" w:hAnsi="Aptos Display"/>
-              </w:rPr>
-            </w:pPr>
+            <w:proofErr w:type="spellEnd"/>
             <w:r>
               <w:rPr>
                 <w:rStyle w:val="Normal1"/>
                 <w:rFonts w:ascii="Aptos Display" w:hAnsi="Aptos Display"/>
               </w:rPr>
-              <w:t>Código</w:t>
-            </w:r>
-            <w:r>
-              <w:rPr>
-                <w:rStyle w:val="Normal1"/>
-                <w:rFonts w:ascii="Aptos Display" w:hAnsi="Aptos Display"/>
-              </w:rPr>
-              <w:t xml:space="preserve"> Interno</w:t>
-            </w:r>
-          </w:p>
-        </w:tc>
-        <w:tc>
-          <w:tcPr>
-            <w:tcW w:w="1864" w:type="dxa"/>
-            <w:shd w:val="clear" w:color="auto" w:fill="D9D9D9" w:themeFill="background1" w:themeFillShade="D9"/>
-          </w:tcPr>
-          <w:p>
-            <w:pPr>
-              <w:jc w:val="center"/>
-              <w:rPr>
-                <w:rStyle w:val="Normal1"/>
-                <w:rFonts w:ascii="Aptos Display" w:hAnsi="Aptos Display"/>
-              </w:rPr>
-            </w:pPr>
-            <w:r>
-              <w:rPr>
-                <w:rStyle w:val="Normal1"/>
-                <w:rFonts w:ascii="Aptos Display" w:hAnsi="Aptos Display"/>
-              </w:rPr>
-              <w:t>Estado</w:t>
+              <w:t xml:space="preserve"> de serie</w:t>
             </w:r>
           </w:p>
         </w:tc>
@@ -602,7 +641,7 @@
       <w:tr>
         <w:tc>
           <w:tcPr>
-            <w:tcW w:w="1696" w:type="dxa"/>
+            <w:tcW w:w="2405" w:type="dxa"/>
           </w:tcPr>
           <w:p>
             <w:pPr>
@@ -617,13 +656,29 @@
                 <w:rStyle w:val="Normal1"/>
                 <w:rFonts w:ascii="Aptos Display" w:hAnsi="Aptos Display"/>
               </w:rPr>
-              <w:t>{#equipos}{tipo}</w:t>
+              <w:t>{#</w:t>
+            </w:r>
+            <w:proofErr w:type="gramStart"/>
+            <w:r>
+              <w:rPr>
+                <w:rStyle w:val="Normal1"/>
+                <w:rFonts w:ascii="Aptos Display" w:hAnsi="Aptos Display"/>
+              </w:rPr>
+              <w:t>equipos}{</w:t>
+            </w:r>
+            <w:proofErr w:type="gramEnd"/>
+            <w:r>
+              <w:rPr>
+                <w:rStyle w:val="Normal1"/>
+                <w:rFonts w:ascii="Aptos Display" w:hAnsi="Aptos Display"/>
+              </w:rPr>
+              <w:t>tipo}</w:t>
             </w:r>
           </w:p>
         </w:tc>
         <w:tc>
           <w:tcPr>
-            <w:tcW w:w="2977" w:type="dxa"/>
+            <w:tcW w:w="5670" w:type="dxa"/>
           </w:tcPr>
           <w:p>
             <w:pPr>
@@ -638,13 +693,29 @@
                 <w:rStyle w:val="Normal1"/>
                 <w:rFonts w:ascii="Aptos Display" w:hAnsi="Aptos Display"/>
               </w:rPr>
-              <w:t>{marca_modelo}</w:t>
+              <w:t>{</w:t>
+            </w:r>
+            <w:proofErr w:type="spellStart"/>
+            <w:r>
+              <w:rPr>
+                <w:rStyle w:val="Normal1"/>
+                <w:rFonts w:ascii="Aptos Display" w:hAnsi="Aptos Display"/>
+              </w:rPr>
+              <w:t>marca_modelo</w:t>
+            </w:r>
+            <w:proofErr w:type="spellEnd"/>
+            <w:r>
+              <w:rPr>
+                <w:rStyle w:val="Normal1"/>
+                <w:rFonts w:ascii="Aptos Display" w:hAnsi="Aptos Display"/>
+              </w:rPr>
+              <w:t>}</w:t>
             </w:r>
           </w:p>
         </w:tc>
         <w:tc>
           <w:tcPr>
-            <w:tcW w:w="2126" w:type="dxa"/>
+            <w:tcW w:w="2755" w:type="dxa"/>
           </w:tcPr>
           <w:p>
             <w:pPr>
@@ -660,12 +731,118 @@
                 <w:rFonts w:ascii="Aptos Display" w:hAnsi="Aptos Display"/>
               </w:rPr>
               <w:t>{serie}</w:t>
+            </w:r>
+          </w:p>
+        </w:tc>
+      </w:tr>
+    </w:tbl>
+    <w:p>
+      <w:pPr>
+        <w:rPr>
+          <w:rStyle w:val="Normal1"/>
+          <w:rFonts w:ascii="Aptos Display" w:hAnsi="Aptos Display"/>
+          <w:sz w:val="22"/>
+          <w:szCs w:val="22"/>
+        </w:rPr>
+      </w:pPr>
+    </w:p>
+    <w:p>
+      <w:pPr>
+        <w:rPr>
+          <w:rStyle w:val="Normal1"/>
+          <w:rFonts w:ascii="Aptos Display" w:hAnsi="Aptos Display"/>
+          <w:sz w:val="22"/>
+          <w:szCs w:val="22"/>
+        </w:rPr>
+      </w:pPr>
+      <w:r>
+        <w:rPr>
+          <w:rStyle w:val="Normal1"/>
+          <w:rFonts w:ascii="Aptos Display" w:hAnsi="Aptos Display"/>
+          <w:sz w:val="22"/>
+          <w:szCs w:val="22"/>
+        </w:rPr>
+        <w:t>FECHA ENTREGA Y DEVOLUCIÓN</w:t>
+      </w:r>
+      <w:r>
+        <w:rPr>
+          <w:rStyle w:val="Normal1"/>
+          <w:rFonts w:ascii="Aptos Display" w:hAnsi="Aptos Display"/>
+          <w:sz w:val="22"/>
+          <w:szCs w:val="22"/>
+        </w:rPr>
+        <w:t>:</w:t>
+      </w:r>
+    </w:p>
+    <w:p>
+      <w:pPr>
+        <w:rPr>
+          <w:rStyle w:val="Normal1"/>
+          <w:rFonts w:ascii="Aptos Display" w:hAnsi="Aptos Display"/>
+          <w:sz w:val="20"/>
+          <w:szCs w:val="20"/>
+        </w:rPr>
+      </w:pPr>
+    </w:p>
+    <w:tbl>
+      <w:tblPr>
+        <w:tblStyle w:val="Tablaconcuadrcula"/>
+        <w:tblW w:w="10830" w:type="dxa"/>
+        <w:tblLayout w:type="fixed"/>
+        <w:tblLook w:val="04A0" w:firstRow="1" w:lastRow="0" w:firstColumn="1" w:lastColumn="0" w:noHBand="0" w:noVBand="1"/>
+      </w:tblPr>
+      <w:tblGrid>
+        <w:gridCol w:w="2778"/>
+        <w:gridCol w:w="2665"/>
+        <w:gridCol w:w="2722"/>
+        <w:gridCol w:w="2665"/>
+      </w:tblGrid>
+      <w:tr>
+        <w:trPr>
+          <w:trHeight w:val="340"/>
+        </w:trPr>
+        <w:tc>
+          <w:tcPr>
+            <w:tcW w:w="2778" w:type="dxa"/>
+            <w:vAlign w:val="center"/>
+          </w:tcPr>
+          <w:p>
+            <w:pPr>
+              <w:jc w:val="center"/>
+              <w:rPr>
+                <w:rStyle w:val="Normal1"/>
+                <w:rFonts w:ascii="Aptos Display" w:hAnsi="Aptos Display"/>
+              </w:rPr>
+            </w:pPr>
+            <w:r>
+              <w:rPr>
+                <w:rStyle w:val="Normal1"/>
+                <w:rFonts w:ascii="Aptos Display" w:hAnsi="Aptos Display"/>
+              </w:rPr>
+              <w:t>{</w:t>
+            </w:r>
+            <w:proofErr w:type="spellStart"/>
+            <w:r>
+              <w:rPr>
+                <w:rStyle w:val="Normal1"/>
+                <w:rFonts w:ascii="Aptos Display" w:hAnsi="Aptos Display"/>
+              </w:rPr>
+              <w:t>fecha_entrega</w:t>
+            </w:r>
+            <w:proofErr w:type="spellEnd"/>
+            <w:r>
+              <w:rPr>
+                <w:rStyle w:val="Normal1"/>
+                <w:rFonts w:ascii="Aptos Display" w:hAnsi="Aptos Display"/>
+              </w:rPr>
+              <w:t>}</w:t>
             </w:r>
           </w:p>
         </w:tc>
         <w:tc>
           <w:tcPr>
-            <w:tcW w:w="2127" w:type="dxa"/>
+            <w:tcW w:w="2665" w:type="dxa"/>
+            <w:vAlign w:val="center"/>
           </w:tcPr>
           <w:p>
             <w:pPr>
@@ -680,13 +857,30 @@
                 <w:rStyle w:val="Normal1"/>
                 <w:rFonts w:ascii="Aptos Display" w:hAnsi="Aptos Display"/>
               </w:rPr>
-              <w:t>{codigo_interno}</w:t>
+              <w:t>{</w:t>
+            </w:r>
+            <w:proofErr w:type="spellStart"/>
+            <w:r>
+              <w:rPr>
+                <w:rStyle w:val="Normal1"/>
+                <w:rFonts w:ascii="Aptos Display" w:hAnsi="Aptos Display"/>
+              </w:rPr>
+              <w:t>hora_entrega</w:t>
+            </w:r>
+            <w:proofErr w:type="spellEnd"/>
+            <w:r>
+              <w:rPr>
+                <w:rStyle w:val="Normal1"/>
+                <w:rFonts w:ascii="Aptos Display" w:hAnsi="Aptos Display"/>
+              </w:rPr>
+              <w:t>}</w:t>
             </w:r>
           </w:p>
         </w:tc>
         <w:tc>
           <w:tcPr>
-            <w:tcW w:w="1864" w:type="dxa"/>
+            <w:tcW w:w="2722" w:type="dxa"/>
+            <w:vAlign w:val="center"/>
           </w:tcPr>
           <w:p>
             <w:pPr>
@@ -701,7 +895,60 @@
                 <w:rStyle w:val="Normal1"/>
                 <w:rFonts w:ascii="Aptos Display" w:hAnsi="Aptos Display"/>
               </w:rPr>
-              <w:t>{estado}{/equipos}</w:t>
+              <w:t>{</w:t>
+            </w:r>
+            <w:proofErr w:type="spellStart"/>
+            <w:r>
+              <w:rPr>
+                <w:rStyle w:val="Normal1"/>
+                <w:rFonts w:ascii="Aptos Display" w:hAnsi="Aptos Display"/>
+              </w:rPr>
+              <w:t>fecha_devolucion</w:t>
+            </w:r>
+            <w:proofErr w:type="spellEnd"/>
+            <w:r>
+              <w:rPr>
+                <w:rStyle w:val="Normal1"/>
+                <w:rFonts w:ascii="Aptos Display" w:hAnsi="Aptos Display"/>
+              </w:rPr>
+              <w:t>}</w:t>
+            </w:r>
+          </w:p>
+        </w:tc>
+        <w:tc>
+          <w:tcPr>
+            <w:tcW w:w="2665" w:type="dxa"/>
+          </w:tcPr>
+          <w:p>
+            <w:pPr>
+              <w:jc w:val="center"/>
+              <w:rPr>
+                <w:rStyle w:val="Normal1"/>
+                <w:rFonts w:ascii="Aptos Display" w:hAnsi="Aptos Display"/>
+              </w:rPr>
+            </w:pPr>
+            <w:r>
+              <w:rPr>
+                <w:rStyle w:val="Normal1"/>
+                <w:rFonts w:ascii="Aptos Display" w:hAnsi="Aptos Display"/>
+              </w:rPr>
+              <w:t>{</w:t>
+            </w:r>
+            <w:proofErr w:type="spellStart"/>
+            <w:r>
+              <w:rPr>
+                <w:rStyle w:val="Normal1"/>
+                <w:rFonts w:ascii="Aptos Display" w:hAnsi="Aptos Display"/>
+              </w:rPr>
+              <w:t>hora_devolucion</w:t>
+            </w:r>
+            <w:proofErr w:type="spellEnd"/>
+            <w:r>
+              <w:rPr>
+                <w:rStyle w:val="Normal1"/>
+                <w:rFonts w:ascii="Aptos Display" w:hAnsi="Aptos Display"/>
+              </w:rPr>
+              <w:t>}</w:t>
             </w:r>
           </w:p>
         </w:tc>
@@ -709,7 +956,8 @@
       <w:tr>
         <w:tc>
           <w:tcPr>
-            <w:tcW w:w="1696" w:type="dxa"/>
+            <w:tcW w:w="2778" w:type="dxa"/>
+            <w:shd w:val="clear" w:color="auto" w:fill="D9D9D9" w:themeFill="background1" w:themeFillShade="D9"/>
           </w:tcPr>
           <w:p>
             <w:pPr>
@@ -719,11 +967,40 @@
                 <w:rFonts w:ascii="Aptos Display" w:hAnsi="Aptos Display"/>
               </w:rPr>
             </w:pPr>
+            <w:r>
+              <w:rPr>
+                <w:rStyle w:val="Normal1"/>
+                <w:rFonts w:ascii="Aptos Display" w:hAnsi="Aptos Display"/>
+              </w:rPr>
+              <w:t>Fecha entrega</w:t>
+            </w:r>
           </w:p>
         </w:tc>
         <w:tc>
           <w:tcPr>
-            <w:tcW w:w="2977" w:type="dxa"/>
+            <w:tcW w:w="2665" w:type="dxa"/>
+            <w:shd w:val="clear" w:color="auto" w:fill="D9D9D9" w:themeFill="background1" w:themeFillShade="D9"/>
+          </w:tcPr>
+          <w:p>
+            <w:pPr>
+              <w:rPr>
+                <w:rStyle w:val="Normal1"/>
+                <w:rFonts w:ascii="Aptos Display" w:hAnsi="Aptos Display"/>
+              </w:rPr>
+            </w:pPr>
+            <w:r>
+              <w:rPr>
+                <w:rStyle w:val="Normal1"/>
+                <w:rFonts w:ascii="Aptos Display" w:hAnsi="Aptos Display"/>
+              </w:rPr>
+              <w:t>Hora entrega</w:t>
+            </w:r>
+          </w:p>
+        </w:tc>
+        <w:tc>
+          <w:tcPr>
+            <w:tcW w:w="2722" w:type="dxa"/>
+            <w:shd w:val="clear" w:color="auto" w:fill="D9D9D9" w:themeFill="background1" w:themeFillShade="D9"/>
           </w:tcPr>
           <w:p>
             <w:pPr>
@@ -733,11 +1010,19 @@
                 <w:rFonts w:ascii="Aptos Display" w:hAnsi="Aptos Display"/>
               </w:rPr>
             </w:pPr>
+            <w:r>
+              <w:rPr>
+                <w:rStyle w:val="Normal1"/>
+                <w:rFonts w:ascii="Aptos Display" w:hAnsi="Aptos Display"/>
+              </w:rPr>
+              <w:t>Fecha devolución</w:t>
+            </w:r>
           </w:p>
         </w:tc>
         <w:tc>
           <w:tcPr>
-            <w:tcW w:w="2126" w:type="dxa"/>
+            <w:tcW w:w="2665" w:type="dxa"/>
+            <w:shd w:val="clear" w:color="auto" w:fill="D9D9D9" w:themeFill="background1" w:themeFillShade="D9"/>
           </w:tcPr>
           <w:p>
             <w:pPr>
@@ -747,322 +1032,13 @@
                 <w:rFonts w:ascii="Aptos Display" w:hAnsi="Aptos Display"/>
               </w:rPr>
             </w:pPr>
-          </w:p>
-        </w:tc>
-        <w:tc>
-          <w:tcPr>
-            <w:tcW w:w="2127" w:type="dxa"/>
-          </w:tcPr>
-          <w:p>
-            <w:pPr>
-              <w:jc w:val="center"/>
-              <w:rPr>
-                <w:rStyle w:val="Normal1"/>
-                <w:rFonts w:ascii="Aptos Display" w:hAnsi="Aptos Display"/>
-              </w:rPr>
-            </w:pPr>
-          </w:p>
-        </w:tc>
-        <w:tc>
-          <w:tcPr>
-            <w:tcW w:w="1864" w:type="dxa"/>
-          </w:tcPr>
-          <w:p>
-            <w:pPr>
-              <w:jc w:val="center"/>
-              <w:rPr>
-                <w:rStyle w:val="Normal1"/>
-                <w:rFonts w:ascii="Aptos Display" w:hAnsi="Aptos Display"/>
-              </w:rPr>
-            </w:pPr>
-          </w:p>
-        </w:tc>
-      </w:tr>
-      <w:tr>
-        <w:tc>
-          <w:tcPr>
-            <w:tcW w:w="1696" w:type="dxa"/>
-          </w:tcPr>
-          <w:p>
-            <w:pPr>
-              <w:jc w:val="center"/>
-              <w:rPr>
-                <w:rStyle w:val="Normal1"/>
-                <w:rFonts w:ascii="Aptos Display" w:hAnsi="Aptos Display"/>
-              </w:rPr>
-            </w:pPr>
-          </w:p>
-        </w:tc>
-        <w:tc>
-          <w:tcPr>
-            <w:tcW w:w="2977" w:type="dxa"/>
-          </w:tcPr>
-          <w:p>
-            <w:pPr>
-              <w:jc w:val="center"/>
-              <w:rPr>
-                <w:rStyle w:val="Normal1"/>
-                <w:rFonts w:ascii="Aptos Display" w:hAnsi="Aptos Display"/>
-              </w:rPr>
-            </w:pPr>
-          </w:p>
-        </w:tc>
-        <w:tc>
-          <w:tcPr>
-            <w:tcW w:w="2126" w:type="dxa"/>
-          </w:tcPr>
-          <w:p>
-            <w:pPr>
-              <w:jc w:val="center"/>
-              <w:rPr>
-                <w:rStyle w:val="Normal1"/>
-                <w:rFonts w:ascii="Aptos Display" w:hAnsi="Aptos Display"/>
-              </w:rPr>
-            </w:pPr>
-          </w:p>
-        </w:tc>
-        <w:tc>
-          <w:tcPr>
-            <w:tcW w:w="2127" w:type="dxa"/>
-          </w:tcPr>
-          <w:p>
-            <w:pPr>
-              <w:jc w:val="center"/>
-              <w:rPr>
-                <w:rStyle w:val="Normal1"/>
-                <w:rFonts w:ascii="Aptos Display" w:hAnsi="Aptos Display"/>
-              </w:rPr>
-            </w:pPr>
-          </w:p>
-        </w:tc>
-        <w:tc>
-          <w:tcPr>
-            <w:tcW w:w="1864" w:type="dxa"/>
-          </w:tcPr>
-          <w:p>
-            <w:pPr>
-              <w:jc w:val="center"/>
-              <w:rPr>
-                <w:rStyle w:val="Normal1"/>
-                <w:rFonts w:ascii="Aptos Display" w:hAnsi="Aptos Display"/>
-              </w:rPr>
-            </w:pPr>
-          </w:p>
-        </w:tc>
-      </w:tr>
-      <w:tr>
-        <w:tc>
-          <w:tcPr>
-            <w:tcW w:w="1696" w:type="dxa"/>
-          </w:tcPr>
-          <w:p>
-            <w:pPr>
-              <w:jc w:val="center"/>
-              <w:rPr>
-                <w:rStyle w:val="Normal1"/>
-                <w:rFonts w:ascii="Aptos Display" w:hAnsi="Aptos Display"/>
-              </w:rPr>
-            </w:pPr>
-          </w:p>
-        </w:tc>
-        <w:tc>
-          <w:tcPr>
-            <w:tcW w:w="2977" w:type="dxa"/>
-          </w:tcPr>
-          <w:p>
-            <w:pPr>
-              <w:jc w:val="center"/>
-              <w:rPr>
-                <w:rStyle w:val="Normal1"/>
-                <w:rFonts w:ascii="Aptos Display" w:hAnsi="Aptos Display"/>
-              </w:rPr>
-            </w:pPr>
-          </w:p>
-        </w:tc>
-        <w:tc>
-          <w:tcPr>
-            <w:tcW w:w="2126" w:type="dxa"/>
-          </w:tcPr>
-          <w:p>
-            <w:pPr>
-              <w:jc w:val="center"/>
-              <w:rPr>
-                <w:rStyle w:val="Normal1"/>
-                <w:rFonts w:ascii="Aptos Display" w:hAnsi="Aptos Display"/>
-              </w:rPr>
-            </w:pPr>
-          </w:p>
-        </w:tc>
-        <w:tc>
-          <w:tcPr>
-            <w:tcW w:w="2127" w:type="dxa"/>
-          </w:tcPr>
-          <w:p>
-            <w:pPr>
-              <w:jc w:val="center"/>
-              <w:rPr>
-                <w:rStyle w:val="Normal1"/>
-                <w:rFonts w:ascii="Aptos Display" w:hAnsi="Aptos Display"/>
-              </w:rPr>
-            </w:pPr>
-          </w:p>
-        </w:tc>
-        <w:tc>
-          <w:tcPr>
-            <w:tcW w:w="1864" w:type="dxa"/>
-          </w:tcPr>
-          <w:p>
-            <w:pPr>
-              <w:jc w:val="center"/>
-              <w:rPr>
-                <w:rStyle w:val="Normal1"/>
-                <w:rFonts w:ascii="Aptos Display" w:hAnsi="Aptos Display"/>
-              </w:rPr>
-            </w:pPr>
-          </w:p>
-        </w:tc>
-      </w:tr>
-      <w:tr>
-        <w:tc>
-          <w:tcPr>
-            <w:tcW w:w="1696" w:type="dxa"/>
-          </w:tcPr>
-          <w:p>
-            <w:pPr>
-              <w:jc w:val="center"/>
-              <w:rPr>
-                <w:rStyle w:val="Normal1"/>
-                <w:rFonts w:ascii="Aptos Display" w:hAnsi="Aptos Display"/>
-              </w:rPr>
-            </w:pPr>
-          </w:p>
-        </w:tc>
-        <w:tc>
-          <w:tcPr>
-            <w:tcW w:w="2977" w:type="dxa"/>
-          </w:tcPr>
-          <w:p>
-            <w:pPr>
-              <w:jc w:val="center"/>
-              <w:rPr>
-                <w:rStyle w:val="Normal1"/>
-                <w:rFonts w:ascii="Aptos Display" w:hAnsi="Aptos Display"/>
-              </w:rPr>
-            </w:pPr>
-          </w:p>
-        </w:tc>
-        <w:tc>
-          <w:tcPr>
-            <w:tcW w:w="2126" w:type="dxa"/>
-          </w:tcPr>
-          <w:p>
-            <w:pPr>
-              <w:jc w:val="center"/>
-              <w:rPr>
-                <w:rStyle w:val="Normal1"/>
-                <w:rFonts w:ascii="Aptos Display" w:hAnsi="Aptos Display"/>
-              </w:rPr>
-            </w:pPr>
-          </w:p>
-        </w:tc>
-        <w:tc>
-          <w:tcPr>
-            <w:tcW w:w="2127" w:type="dxa"/>
-          </w:tcPr>
-          <w:p>
-            <w:pPr>
-              <w:jc w:val="center"/>
-              <w:rPr>
-                <w:rStyle w:val="Normal1"/>
-                <w:rFonts w:ascii="Aptos Display" w:hAnsi="Aptos Display"/>
-              </w:rPr>
-            </w:pPr>
-          </w:p>
-        </w:tc>
-        <w:tc>
-          <w:tcPr>
-            <w:tcW w:w="1864" w:type="dxa"/>
-          </w:tcPr>
-          <w:p>
-            <w:pPr>
-              <w:jc w:val="center"/>
-              <w:rPr>
-                <w:rStyle w:val="Normal1"/>
-                <w:rFonts w:ascii="Aptos Display" w:hAnsi="Aptos Display"/>
-              </w:rPr>
-            </w:pPr>
-          </w:p>
-        </w:tc>
-      </w:tr>
-      <w:tr>
-        <w:tc>
-          <w:tcPr>
-            <w:tcW w:w="1696" w:type="dxa"/>
-          </w:tcPr>
-          <w:p>
-            <w:pPr>
-              <w:jc w:val="center"/>
-              <w:rPr>
-                <w:rStyle w:val="Normal1"/>
-                <w:rFonts w:ascii="Aptos Display" w:hAnsi="Aptos Display"/>
-              </w:rPr>
-            </w:pPr>
-          </w:p>
-        </w:tc>
-        <w:tc>
-          <w:tcPr>
-            <w:tcW w:w="2977" w:type="dxa"/>
-          </w:tcPr>
-          <w:p>
-            <w:pPr>
-              <w:jc w:val="center"/>
-              <w:rPr>
-                <w:rStyle w:val="Normal1"/>
-                <w:rFonts w:ascii="Aptos Display" w:hAnsi="Aptos Display"/>
-              </w:rPr>
-            </w:pPr>
-          </w:p>
-        </w:tc>
-        <w:tc>
-          <w:tcPr>
-            <w:tcW w:w="2126" w:type="dxa"/>
-          </w:tcPr>
-          <w:p>
-            <w:pPr>
-              <w:jc w:val="center"/>
-              <w:rPr>
-                <w:rStyle w:val="Normal1"/>
-                <w:rFonts w:ascii="Aptos Display" w:hAnsi="Aptos Display"/>
-              </w:rPr>
-            </w:pPr>
-          </w:p>
-        </w:tc>
-        <w:tc>
-          <w:tcPr>
-            <w:tcW w:w="2127" w:type="dxa"/>
-          </w:tcPr>
-          <w:p>
-            <w:pPr>
-              <w:jc w:val="center"/>
-              <w:rPr>
-                <w:rStyle w:val="Normal1"/>
-                <w:rFonts w:ascii="Aptos Display" w:hAnsi="Aptos Display"/>
-              </w:rPr>
-            </w:pPr>
-          </w:p>
-        </w:tc>
-        <w:tc>
-          <w:tcPr>
-            <w:tcW w:w="1864" w:type="dxa"/>
-          </w:tcPr>
-          <w:p>
-            <w:pPr>
-              <w:jc w:val="center"/>
-              <w:rPr>
-                <w:rStyle w:val="Normal1"/>
-                <w:rFonts w:ascii="Aptos Display" w:hAnsi="Aptos Display"/>
-              </w:rPr>
-            </w:pPr>
+            <w:r>
+              <w:rPr>
+                <w:rStyle w:val="Normal1"/>
+                <w:rFonts w:ascii="Aptos Display" w:hAnsi="Aptos Display"/>
+              </w:rPr>
+              <w:t>Hora devolución</w:t>
+            </w:r>
           </w:p>
         </w:tc>
       </w:tr>
@@ -1322,7 +1298,25 @@
                 <w:sz w:val="20"/>
                 <w:szCs w:val="20"/>
               </w:rPr>
-              <w:t>4. Al término de la relación laboral, los equipos deben ser devueltos en el mismo estado, salvo desgaste por uso normal.</w:t>
+              <w:t xml:space="preserve">4. </w:t>
+            </w:r>
+            <w:r>
+              <w:rPr>
+                <w:rFonts w:ascii="Aptos Display" w:hAnsi="Aptos Display"/>
+                <w:color w:val="000000"/>
+                <w:sz w:val="20"/>
+                <w:szCs w:val="20"/>
+              </w:rPr>
+              <w:t>El equipo debe ser devuelto en las mismas condiciones en las que fue entregado, en la fecha y hora acordadas</w:t>
+            </w:r>
+            <w:r>
+              <w:rPr>
+                <w:rFonts w:ascii="Aptos Display" w:hAnsi="Aptos Display"/>
+                <w:color w:val="000000"/>
+                <w:sz w:val="20"/>
+                <w:szCs w:val="20"/>
+              </w:rPr>
+              <w:t>.</w:t>
             </w:r>
           </w:p>
           <w:p>
@@ -1800,7 +1794,25 @@
         <w:sz w:val="22"/>
         <w:szCs w:val="22"/>
       </w:rPr>
-      <w:t>ACTA DE ENTREGA EQUIPO COMPUTACIONAL</w:t>
+      <w:t xml:space="preserve">ACTA DE </w:t>
+    </w:r>
+    <w:r>
+      <w:rPr>
+        <w:rFonts w:ascii="Century Gothic" w:hAnsi="Century Gothic" w:cs="Arial"/>
+        <w:b/>
+        <w:sz w:val="22"/>
+        <w:szCs w:val="22"/>
+      </w:rPr>
+      <w:t>PRESTAMO</w:t>
+    </w:r>
+    <w:r>
+      <w:rPr>
+        <w:rFonts w:ascii="Century Gothic" w:hAnsi="Century Gothic" w:cs="Arial"/>
+        <w:b/>
+        <w:sz w:val="22"/>
+        <w:szCs w:val="22"/>
+      </w:rPr>
+      <w:t xml:space="preserve"> EQUIPO COMPUTACIONAL</w:t>
     </w:r>
   </w:p>
 </w:hdr>
@@ -5868,6 +5880,7 @@
   <w:style w:type="character" w:default="1" w:styleId="Fuentedeprrafopredeter">
     <w:name w:val="Default Paragraph Font"/>
     <w:uiPriority w:val="1"/>
+    <w:semiHidden/>
     <w:unhideWhenUsed/>
   </w:style>
   <w:style w:type="table" w:default="1" w:styleId="Tablanormal">

</xml_diff>